<commit_message>
Update meeting.docx - dept name to 연구개발실
</commit_message>
<xml_diff>
--- a/meeting.docx
+++ b/meeting.docx
@@ -33,7 +33,7 @@
           <w:sz w:val="24"/>
           <w:szCs w:val="24"/>
         </w:rPr>
-        <w:t xml:space="preserve">위너콤 × 인시스 AI혁신 R&amp;D센터 미팅</w:t>
+        <w:t xml:space="preserve">위너콤 × 인시스 AI혁신 연구개발실 미팅</w:t>
       </w:r>
     </w:p>
     <w:p>
@@ -308,7 +308,7 @@
                 <w:sz w:val="19"/>
                 <w:szCs w:val="19"/>
               </w:rPr>
-              <w:t xml:space="preserve">AI혁신 R&amp;D센터 개발진</w:t>
+              <w:t xml:space="preserve">AI혁신 연구개발실 개발진</w:t>
             </w:r>
           </w:p>
         </w:tc>
@@ -428,7 +428,7 @@
                 <w:sz w:val="19"/>
                 <w:szCs w:val="19"/>
               </w:rPr>
-              <w:t xml:space="preserve">인시스 AI혁신 R&amp;D센터</w:t>
+              <w:t xml:space="preserve">인시스 AI혁신 연구개발실</w:t>
             </w:r>
           </w:p>
         </w:tc>
@@ -4194,7 +4194,7 @@
         <w:sz w:val="16"/>
         <w:szCs w:val="16"/>
       </w:rPr>
-      <w:t xml:space="preserve">© 2026 인시스 AI혁신 R&amp;D센터  |  대외비  |  v1.0</w:t>
+      <w:t xml:space="preserve">© 2026 인시스 AI혁신 연구개발실  |  대외비  |  v1.0</w:t>
     </w:r>
   </w:p>
 </w:ftr>
@@ -4251,7 +4251,7 @@
         <w:sz w:val="17"/>
         <w:szCs w:val="17"/>
       </w:rPr>
-      <w:t xml:space="preserve">인시스 AI혁신 R&amp;D센터  |  위너콤 비전검사기 도입 미팅자료</w:t>
+      <w:t xml:space="preserve">인시스 AI혁신 연구개발실  |  위너콤 비전검사기 도입 미팅자료</w:t>
     </w:r>
   </w:p>
 </w:hdr>

</xml_diff>

<commit_message>
Update meeting.docx - remove vibration/contamination, add ESD
</commit_message>
<xml_diff>
--- a/meeting.docx
+++ b/meeting.docx
@@ -2579,31 +2579,7 @@
           <w:sz w:val="20"/>
           <w:szCs w:val="20"/>
         </w:rPr>
-        <w:t xml:space="preserve">바닥 진동 수준 (인근 프레스·중장비 유무)</w:t>
-      </w:r>
-    </w:p>
-    <w:p>
-      <w:pPr>
-        <w:spacing w:after="26" w:before="26"/>
-        <w:ind w:left="340"/>
-      </w:pPr>
-      <w:r>
-        <w:rPr>
-          <w:rFonts w:ascii="맑은 고딕" w:cs="맑은 고딕" w:eastAsia="맑은 고딕" w:hAnsi="맑은 고딕"/>
-          <w:color w:val="2E4D8A"/>
-          <w:sz w:val="20"/>
-          <w:szCs w:val="20"/>
-        </w:rPr>
-        <w:t xml:space="preserve">☐  </w:t>
-      </w:r>
-      <w:r>
-        <w:rPr>
-          <w:rFonts w:ascii="맑은 고딕" w:cs="맑은 고딕" w:eastAsia="맑은 고딕" w:hAnsi="맑은 고딕"/>
-          <w:color w:val="2E2E2E"/>
-          <w:sz w:val="20"/>
-          <w:szCs w:val="20"/>
-        </w:rPr>
-        <w:t xml:space="preserve">분진·유증기 등 오염 환경</w:t>
+        <w:t xml:space="preserve">정전기(ESD) 관리 요구 (접지·이오나이저 등)</w:t>
       </w:r>
     </w:p>
     <w:p>

</xml_diff>

<commit_message>
Update meeting.docx - intro sequence not type selection, 1st meeting focus
</commit_message>
<xml_diff>
--- a/meeting.docx
+++ b/meeting.docx
@@ -465,11 +465,13 @@
       <w:r>
         <w:rPr>
           <w:rFonts w:ascii="맑은 고딕" w:cs="맑은 고딕" w:eastAsia="맑은 고딕" w:hAnsi="맑은 고딕"/>
-          <w:color w:val="2E2E2E"/>
-          <w:sz w:val="20"/>
-          <w:szCs w:val="20"/>
-        </w:rPr>
-        <w:t xml:space="preserve">이번 미팅의 목표는 검사기 구성 방향을 합의하고, 상세 제안서 작성에 필요한 현장 정보를 확보하는 것입니다. 미팅 이후 구체적 구성요소와 개발 일정을 담은 상세 제안서를 제출하게 되므로, 본 미팅에서 사양의 뼈대를 확정합니다.</w:t>
+          <w:b/>
+          <w:bCs/>
+          <w:color w:val="2E2E2E"/>
+          <w:sz w:val="20"/>
+          <w:szCs w:val="20"/>
+        </w:rPr>
+        <w:t xml:space="preserve">본 미팅은 1차 미팅으로, 고객사의 요구조건을 최대한 상세히 청취하고 검사기 설계에 필요한 자료를 최대한 많이 확보하는 것이 핵심 목표입니다. 이 단계에서 수집한 정보를 바탕으로 검증기를 우선 제작하며, 이후 양산형 검사기의 구성과 상세 제안서를 확정합니다.</w:t>
       </w:r>
     </w:p>
     <w:p>
@@ -490,7 +492,7 @@
           <w:sz w:val="20"/>
           <w:szCs w:val="20"/>
         </w:rPr>
-        <w:t xml:space="preserve">핵심 합의 사항</w:t>
+        <w:t xml:space="preserve">1차 미팅 중점 사항</w:t>
       </w:r>
     </w:p>
     <w:p>
@@ -514,7 +516,7 @@
           <w:sz w:val="20"/>
           <w:szCs w:val="20"/>
         </w:rPr>
-        <w:t xml:space="preserve">검사기 타입 방향 설정 (검증형 우선 → 자동화형 확장)</w:t>
+        <w:t xml:space="preserve">고객사 검사 요구조건·불량 정의 최대한 청취</w:t>
       </w:r>
     </w:p>
     <w:p>
@@ -538,7 +540,7 @@
           <w:sz w:val="20"/>
           <w:szCs w:val="20"/>
         </w:rPr>
-        <w:t xml:space="preserve">검사 대상 불량 유형과 요구 검출 수준 확정</w:t>
+        <w:t xml:space="preserve">검사기 설계용 자료 확보 (샘플, 도면, 라인 정보 등)</w:t>
       </w:r>
     </w:p>
     <w:p>
@@ -562,7 +564,31 @@
           <w:sz w:val="20"/>
           <w:szCs w:val="20"/>
         </w:rPr>
-        <w:t xml:space="preserve">현장 사전 실사 일정 확정</w:t>
+        <w:t xml:space="preserve">검증기 → 양산형 도입 순서 및 임대 방식 공유</w:t>
+      </w:r>
+    </w:p>
+    <w:p>
+      <w:pPr>
+        <w:spacing w:after="24" w:before="24"/>
+        <w:ind w:left="300"/>
+      </w:pPr>
+      <w:r>
+        <w:rPr>
+          <w:rFonts w:ascii="맑은 고딕" w:cs="맑은 고딕" w:eastAsia="맑은 고딕" w:hAnsi="맑은 고딕"/>
+          <w:color w:val="2E4D8A"/>
+          <w:sz w:val="20"/>
+          <w:szCs w:val="20"/>
+        </w:rPr>
+        <w:t xml:space="preserve">· </w:t>
+      </w:r>
+      <w:r>
+        <w:rPr>
+          <w:rFonts w:ascii="맑은 고딕" w:cs="맑은 고딕" w:eastAsia="맑은 고딕" w:hAnsi="맑은 고딕"/>
+          <w:color w:val="2E2E2E"/>
+          <w:sz w:val="20"/>
+          <w:szCs w:val="20"/>
+        </w:rPr>
+        <w:t xml:space="preserve">현장 실사 일정 협의</w:t>
       </w:r>
     </w:p>
     <w:p>
@@ -600,7 +626,7 @@
           <w:sz w:val="20"/>
           <w:szCs w:val="20"/>
         </w:rPr>
-        <w:t xml:space="preserve">인시스가 검증용 장비를 자체 투자하여 제작하고, 위너콤에는 임대 방식으로 제공합니다. 고객사는 초기 설비 투자 부담 없이 딥러닝 검사 효과를 검증할 수 있으며, 검증 성공 후 자동화 확장 여부를 단계적으로 결정할 수 있습니다.</w:t>
+        <w:t xml:space="preserve">인시스가 검사기를 자체 투자하여 제작하고, 위너콤에는 월 임대 방식으로 제공합니다. 고객사는 초기 설비 투자 부담 없이 딥러닝 검사 효과를 검증할 수 있으며, 검증 완료 후 양산형 검사기로 전환할 때 필요한 기능만 선택하여 임대료를 조정할 수 있습니다.</w:t>
       </w:r>
     </w:p>
     <w:p>
@@ -896,6 +922,66 @@
                 <w:sz w:val="19"/>
                 <w:szCs w:val="19"/>
               </w:rPr>
+              <w:t xml:space="preserve">임대료 구조</w:t>
+            </w:r>
+          </w:p>
+        </w:tc>
+        <w:tc>
+          <w:tcPr>
+            <w:tcW w:type="dxa" w:w="7152"/>
+            <w:tcMar>
+              <w:top w:type="dxa" w:w="40"/>
+              <w:left w:type="dxa" w:w="80"/>
+              <w:bottom w:type="dxa" w:w="40"/>
+              <w:right w:type="dxa" w:w="80"/>
+            </w:tcMar>
+            <w:vAlign w:val="center"/>
+          </w:tcPr>
+          <w:p>
+            <w:pPr>
+              <w:spacing w:after="0" w:before="0"/>
+              <w:jc w:val="left"/>
+            </w:pPr>
+            <w:r>
+              <w:rPr>
+                <w:rFonts w:ascii="맑은 고딕" w:cs="맑은 고딕" w:eastAsia="맑은 고딕" w:hAnsi="맑은 고딕"/>
+                <w:b w:val="false"/>
+                <w:bCs w:val="false"/>
+                <w:color w:val="2E2E2E"/>
+                <w:sz w:val="19"/>
+                <w:szCs w:val="19"/>
+              </w:rPr>
+              <w:t xml:space="preserve">양산형 기능 범위에 따라 차등</w:t>
+            </w:r>
+          </w:p>
+        </w:tc>
+      </w:tr>
+      <w:tr>
+        <w:tc>
+          <w:tcPr>
+            <w:tcW w:type="dxa" w:w="2600"/>
+            <w:tcMar>
+              <w:top w:type="dxa" w:w="40"/>
+              <w:left w:type="dxa" w:w="80"/>
+              <w:bottom w:type="dxa" w:w="40"/>
+              <w:right w:type="dxa" w:w="80"/>
+            </w:tcMar>
+            <w:vAlign w:val="center"/>
+          </w:tcPr>
+          <w:p>
+            <w:pPr>
+              <w:spacing w:after="0" w:before="0"/>
+              <w:jc w:val="left"/>
+            </w:pPr>
+            <w:r>
+              <w:rPr>
+                <w:rFonts w:ascii="맑은 고딕" w:cs="맑은 고딕" w:eastAsia="맑은 고딕" w:hAnsi="맑은 고딕"/>
+                <w:b w:val="false"/>
+                <w:bCs w:val="false"/>
+                <w:color w:val="2E2E2E"/>
+                <w:sz w:val="19"/>
+                <w:szCs w:val="19"/>
+              </w:rPr>
               <w:t xml:space="preserve">검증 실패 시</w:t>
             </w:r>
           </w:p>
@@ -952,23 +1038,44 @@
           <w:sz w:val="24"/>
           <w:szCs w:val="24"/>
         </w:rPr>
-        <w:t xml:space="preserve">3. 2가지 검사기 타입 제안</w:t>
-      </w:r>
-    </w:p>
-    <w:p>
-      <w:pPr>
-        <w:spacing w:after="55" w:before="150"/>
+        <w:t xml:space="preserve">3. 검사기 도입 순서 (2단계)</w:t>
+      </w:r>
+    </w:p>
+    <w:p>
+      <w:pPr>
+        <w:spacing w:after="30" w:before="30"/>
       </w:pPr>
       <w:r>
         <w:rPr>
           <w:rFonts w:ascii="맑은 고딕" w:cs="맑은 고딕" w:eastAsia="맑은 고딕" w:hAnsi="맑은 고딕"/>
           <w:b/>
           <w:bCs/>
+          <w:color w:val="2E2E2E"/>
+          <w:sz w:val="20"/>
+          <w:szCs w:val="20"/>
+        </w:rPr>
+        <w:t xml:space="preserve">검사기는 타입을 선택하는 것이 아니라, 검증기를 먼저 도입하여 딥러닝 검출력을 확인한 뒤 양산형 검사기를 제작하는 순서로 진행됩니다. 양산형은 고객사 라인 상황과 요구 기능에 맞춰 기구 구성을 달리하며, 기능이 많아질수록 월 임대료가 높아지는 구조입니다.</w:t>
+      </w:r>
+    </w:p>
+    <w:p>
+      <w:pPr>
+        <w:spacing w:after="0" w:before="0"/>
+      </w:pPr>
+    </w:p>
+    <w:p>
+      <w:pPr>
+        <w:spacing w:after="55" w:before="150"/>
+      </w:pPr>
+      <w:r>
+        <w:rPr>
+          <w:rFonts w:ascii="맑은 고딕" w:cs="맑은 고딕" w:eastAsia="맑은 고딕" w:hAnsi="맑은 고딕"/>
+          <w:b/>
+          <w:bCs/>
           <w:color w:val="2E4D8A"/>
           <w:sz w:val="21"/>
           <w:szCs w:val="21"/>
         </w:rPr>
-        <w:t xml:space="preserve">TYPE 1 — 검증형 (딥러닝 검출력 검증 전용)</w:t>
+        <w:t xml:space="preserve">1단계 — 검증기 (딥러닝 검출력 검증)</w:t>
       </w:r>
     </w:p>
     <w:p>
@@ -1003,7 +1110,7 @@
           <w:sz w:val="21"/>
           <w:szCs w:val="21"/>
         </w:rPr>
-        <w:t xml:space="preserve">TYPE 2 — 자동화형 (검증 완료 후 전환)</w:t>
+        <w:t xml:space="preserve">2단계 — 양산형 검사기 (검증 완료 후 제작)</w:t>
       </w:r>
     </w:p>
     <w:p>
@@ -1017,13 +1124,29 @@
           <w:sz w:val="20"/>
           <w:szCs w:val="20"/>
         </w:rPr>
-        <w:t xml:space="preserve">검증이 끝나면 작업자가 대상품을 올려두기만 하면 검사 후 자동 배출되는 방식입니다. 이송 구조는 고객사 라인 여건에 맞춰 컨베어 방식 또는 턴테이블 방식 중 선택합니다.</w:t>
+        <w:t xml:space="preserve">검증에서 검출력이 확인되면, 고객사 라인 상황에 맞춰 양산형 검사기를 제작합니다. 자동 투입·배출, 이송 방식(컨베어·턴테이블 등), 바코드 자동 스캔, NG 자동 분리, MES 연동 등 필요한 기능을 고객사와 협의하여 구성합니다. 적용 기능 범위에 따라 제작 사양과 월 임대료가 결정됩니다.</w:t>
       </w:r>
     </w:p>
     <w:p>
       <w:pPr>
         <w:spacing w:after="0" w:before="0"/>
       </w:pPr>
+    </w:p>
+    <w:p>
+      <w:pPr>
+        <w:spacing w:after="40" w:before="110"/>
+      </w:pPr>
+      <w:r>
+        <w:rPr>
+          <w:rFonts w:ascii="맑은 고딕" w:cs="맑은 고딕" w:eastAsia="맑은 고딕" w:hAnsi="맑은 고딕"/>
+          <w:b/>
+          <w:bCs/>
+          <w:color w:val="1F3864"/>
+          <w:sz w:val="20"/>
+          <w:szCs w:val="20"/>
+        </w:rPr>
+        <w:t xml:space="preserve">기능 구성에 따른 임대료 개념</w:t>
+      </w:r>
     </w:p>
     <w:tbl>
       <w:tblPr>
@@ -1049,7 +1172,7 @@
         </w:trPr>
         <w:tc>
           <w:tcPr>
-            <w:tcW w:type="dxa" w:w="1800"/>
+            <w:tcW w:type="dxa" w:w="2000"/>
             <w:shd w:fill="D9E2F3" w:val="clear"/>
             <w:tcMar>
               <w:top w:type="dxa" w:w="40"/>
@@ -1073,13 +1196,13 @@
                 <w:sz w:val="19"/>
                 <w:szCs w:val="19"/>
               </w:rPr>
-              <w:t xml:space="preserve">구분</w:t>
-            </w:r>
-          </w:p>
-        </w:tc>
-        <w:tc>
-          <w:tcPr>
-            <w:tcW w:type="dxa" w:w="3976"/>
+              <w:t xml:space="preserve">구성 수준</w:t>
+            </w:r>
+          </w:p>
+        </w:tc>
+        <w:tc>
+          <w:tcPr>
+            <w:tcW w:type="dxa" w:w="5252"/>
             <w:shd w:fill="D9E2F3" w:val="clear"/>
             <w:tcMar>
               <w:top w:type="dxa" w:w="40"/>
@@ -1103,13 +1226,13 @@
                 <w:sz w:val="19"/>
                 <w:szCs w:val="19"/>
               </w:rPr>
-              <w:t xml:space="preserve">컨베어 방식</w:t>
-            </w:r>
-          </w:p>
-        </w:tc>
-        <w:tc>
-          <w:tcPr>
-            <w:tcW w:type="dxa" w:w="3976"/>
+              <w:t xml:space="preserve">포함 기능 예시</w:t>
+            </w:r>
+          </w:p>
+        </w:tc>
+        <w:tc>
+          <w:tcPr>
+            <w:tcW w:type="dxa" w:w="2500"/>
             <w:shd w:fill="D9E2F3" w:val="clear"/>
             <w:tcMar>
               <w:top w:type="dxa" w:w="40"/>
@@ -1133,7 +1256,7 @@
                 <w:sz w:val="19"/>
                 <w:szCs w:val="19"/>
               </w:rPr>
-              <w:t xml:space="preserve">턴테이블 방식</w:t>
+              <w:t xml:space="preserve">월 임대료</w:t>
             </w:r>
           </w:p>
         </w:tc>
@@ -1141,88 +1264,88 @@
       <w:tr>
         <w:tc>
           <w:tcPr>
-            <w:tcW w:type="dxa" w:w="1800"/>
-            <w:tcMar>
-              <w:top w:type="dxa" w:w="40"/>
-              <w:left w:type="dxa" w:w="80"/>
-              <w:bottom w:type="dxa" w:w="40"/>
-              <w:right w:type="dxa" w:w="80"/>
-            </w:tcMar>
-            <w:vAlign w:val="center"/>
-          </w:tcPr>
-          <w:p>
-            <w:pPr>
-              <w:spacing w:after="0" w:before="0"/>
-              <w:jc w:val="left"/>
-            </w:pPr>
-            <w:r>
-              <w:rPr>
-                <w:rFonts w:ascii="맑은 고딕" w:cs="맑은 고딕" w:eastAsia="맑은 고딕" w:hAnsi="맑은 고딕"/>
-                <w:b w:val="false"/>
-                <w:bCs w:val="false"/>
-                <w:color w:val="2E2E2E"/>
-                <w:sz w:val="19"/>
-                <w:szCs w:val="19"/>
-              </w:rPr>
-              <w:t xml:space="preserve">이송 흐름</w:t>
-            </w:r>
-          </w:p>
-        </w:tc>
-        <w:tc>
-          <w:tcPr>
-            <w:tcW w:type="dxa" w:w="3976"/>
-            <w:tcMar>
-              <w:top w:type="dxa" w:w="40"/>
-              <w:left w:type="dxa" w:w="80"/>
-              <w:bottom w:type="dxa" w:w="40"/>
-              <w:right w:type="dxa" w:w="80"/>
-            </w:tcMar>
-            <w:vAlign w:val="center"/>
-          </w:tcPr>
-          <w:p>
-            <w:pPr>
-              <w:spacing w:after="0" w:before="0"/>
-              <w:jc w:val="left"/>
-            </w:pPr>
-            <w:r>
-              <w:rPr>
-                <w:rFonts w:ascii="맑은 고딕" w:cs="맑은 고딕" w:eastAsia="맑은 고딕" w:hAnsi="맑은 고딕"/>
-                <w:b w:val="false"/>
-                <w:bCs w:val="false"/>
-                <w:color w:val="2E2E2E"/>
-                <w:sz w:val="19"/>
-                <w:szCs w:val="19"/>
-              </w:rPr>
-              <w:t xml:space="preserve">직선 통과 (투입→검사→배출)</w:t>
-            </w:r>
-          </w:p>
-        </w:tc>
-        <w:tc>
-          <w:tcPr>
-            <w:tcW w:type="dxa" w:w="3976"/>
-            <w:tcMar>
-              <w:top w:type="dxa" w:w="40"/>
-              <w:left w:type="dxa" w:w="80"/>
-              <w:bottom w:type="dxa" w:w="40"/>
-              <w:right w:type="dxa" w:w="80"/>
-            </w:tcMar>
-            <w:vAlign w:val="center"/>
-          </w:tcPr>
-          <w:p>
-            <w:pPr>
-              <w:spacing w:after="0" w:before="0"/>
-              <w:jc w:val="left"/>
-            </w:pPr>
-            <w:r>
-              <w:rPr>
-                <w:rFonts w:ascii="맑은 고딕" w:cs="맑은 고딕" w:eastAsia="맑은 고딕" w:hAnsi="맑은 고딕"/>
-                <w:b w:val="false"/>
-                <w:bCs w:val="false"/>
-                <w:color w:val="2E2E2E"/>
-                <w:sz w:val="19"/>
-                <w:szCs w:val="19"/>
-              </w:rPr>
-              <w:t xml:space="preserve">회전 인덱싱 (다스테이션)</w:t>
+            <w:tcW w:type="dxa" w:w="2000"/>
+            <w:tcMar>
+              <w:top w:type="dxa" w:w="40"/>
+              <w:left w:type="dxa" w:w="80"/>
+              <w:bottom w:type="dxa" w:w="40"/>
+              <w:right w:type="dxa" w:w="80"/>
+            </w:tcMar>
+            <w:vAlign w:val="center"/>
+          </w:tcPr>
+          <w:p>
+            <w:pPr>
+              <w:spacing w:after="0" w:before="0"/>
+              <w:jc w:val="left"/>
+            </w:pPr>
+            <w:r>
+              <w:rPr>
+                <w:rFonts w:ascii="맑은 고딕" w:cs="맑은 고딕" w:eastAsia="맑은 고딕" w:hAnsi="맑은 고딕"/>
+                <w:b w:val="false"/>
+                <w:bCs w:val="false"/>
+                <w:color w:val="2E2E2E"/>
+                <w:sz w:val="19"/>
+                <w:szCs w:val="19"/>
+              </w:rPr>
+              <w:t xml:space="preserve">기본형</w:t>
+            </w:r>
+          </w:p>
+        </w:tc>
+        <w:tc>
+          <w:tcPr>
+            <w:tcW w:type="dxa" w:w="5252"/>
+            <w:tcMar>
+              <w:top w:type="dxa" w:w="40"/>
+              <w:left w:type="dxa" w:w="80"/>
+              <w:bottom w:type="dxa" w:w="40"/>
+              <w:right w:type="dxa" w:w="80"/>
+            </w:tcMar>
+            <w:vAlign w:val="center"/>
+          </w:tcPr>
+          <w:p>
+            <w:pPr>
+              <w:spacing w:after="0" w:before="0"/>
+              <w:jc w:val="left"/>
+            </w:pPr>
+            <w:r>
+              <w:rPr>
+                <w:rFonts w:ascii="맑은 고딕" w:cs="맑은 고딕" w:eastAsia="맑은 고딕" w:hAnsi="맑은 고딕"/>
+                <w:b w:val="false"/>
+                <w:bCs w:val="false"/>
+                <w:color w:val="2E2E2E"/>
+                <w:sz w:val="19"/>
+                <w:szCs w:val="19"/>
+              </w:rPr>
+              <w:t xml:space="preserve">딥러닝 검사 + 수동 투입·배출</w:t>
+            </w:r>
+          </w:p>
+        </w:tc>
+        <w:tc>
+          <w:tcPr>
+            <w:tcW w:type="dxa" w:w="2500"/>
+            <w:tcMar>
+              <w:top w:type="dxa" w:w="40"/>
+              <w:left w:type="dxa" w:w="80"/>
+              <w:bottom w:type="dxa" w:w="40"/>
+              <w:right w:type="dxa" w:w="80"/>
+            </w:tcMar>
+            <w:vAlign w:val="center"/>
+          </w:tcPr>
+          <w:p>
+            <w:pPr>
+              <w:spacing w:after="0" w:before="0"/>
+              <w:jc w:val="left"/>
+            </w:pPr>
+            <w:r>
+              <w:rPr>
+                <w:rFonts w:ascii="맑은 고딕" w:cs="맑은 고딕" w:eastAsia="맑은 고딕" w:hAnsi="맑은 고딕"/>
+                <w:b w:val="false"/>
+                <w:bCs w:val="false"/>
+                <w:color w:val="2E2E2E"/>
+                <w:sz w:val="19"/>
+                <w:szCs w:val="19"/>
+              </w:rPr>
+              <w:t xml:space="preserve">낮음</w:t>
             </w:r>
           </w:p>
         </w:tc>
@@ -1230,88 +1353,88 @@
       <w:tr>
         <w:tc>
           <w:tcPr>
-            <w:tcW w:type="dxa" w:w="1800"/>
-            <w:tcMar>
-              <w:top w:type="dxa" w:w="40"/>
-              <w:left w:type="dxa" w:w="80"/>
-              <w:bottom w:type="dxa" w:w="40"/>
-              <w:right w:type="dxa" w:w="80"/>
-            </w:tcMar>
-            <w:vAlign w:val="center"/>
-          </w:tcPr>
-          <w:p>
-            <w:pPr>
-              <w:spacing w:after="0" w:before="0"/>
-              <w:jc w:val="left"/>
-            </w:pPr>
-            <w:r>
-              <w:rPr>
-                <w:rFonts w:ascii="맑은 고딕" w:cs="맑은 고딕" w:eastAsia="맑은 고딕" w:hAnsi="맑은 고딕"/>
-                <w:b w:val="false"/>
-                <w:bCs w:val="false"/>
-                <w:color w:val="2E2E2E"/>
-                <w:sz w:val="19"/>
-                <w:szCs w:val="19"/>
-              </w:rPr>
-              <w:t xml:space="preserve">적합 라인</w:t>
-            </w:r>
-          </w:p>
-        </w:tc>
-        <w:tc>
-          <w:tcPr>
-            <w:tcW w:type="dxa" w:w="3976"/>
-            <w:tcMar>
-              <w:top w:type="dxa" w:w="40"/>
-              <w:left w:type="dxa" w:w="80"/>
-              <w:bottom w:type="dxa" w:w="40"/>
-              <w:right w:type="dxa" w:w="80"/>
-            </w:tcMar>
-            <w:vAlign w:val="center"/>
-          </w:tcPr>
-          <w:p>
-            <w:pPr>
-              <w:spacing w:after="0" w:before="0"/>
-              <w:jc w:val="left"/>
-            </w:pPr>
-            <w:r>
-              <w:rPr>
-                <w:rFonts w:ascii="맑은 고딕" w:cs="맑은 고딕" w:eastAsia="맑은 고딕" w:hAnsi="맑은 고딕"/>
-                <w:b w:val="false"/>
-                <w:bCs w:val="false"/>
-                <w:color w:val="2E2E2E"/>
-                <w:sz w:val="19"/>
-                <w:szCs w:val="19"/>
-              </w:rPr>
-              <w:t xml:space="preserve">직선 흐름 라인</w:t>
-            </w:r>
-          </w:p>
-        </w:tc>
-        <w:tc>
-          <w:tcPr>
-            <w:tcW w:type="dxa" w:w="3976"/>
-            <w:tcMar>
-              <w:top w:type="dxa" w:w="40"/>
-              <w:left w:type="dxa" w:w="80"/>
-              <w:bottom w:type="dxa" w:w="40"/>
-              <w:right w:type="dxa" w:w="80"/>
-            </w:tcMar>
-            <w:vAlign w:val="center"/>
-          </w:tcPr>
-          <w:p>
-            <w:pPr>
-              <w:spacing w:after="0" w:before="0"/>
-              <w:jc w:val="left"/>
-            </w:pPr>
-            <w:r>
-              <w:rPr>
-                <w:rFonts w:ascii="맑은 고딕" w:cs="맑은 고딕" w:eastAsia="맑은 고딕" w:hAnsi="맑은 고딕"/>
-                <w:b w:val="false"/>
-                <w:bCs w:val="false"/>
-                <w:color w:val="2E2E2E"/>
-                <w:sz w:val="19"/>
-                <w:szCs w:val="19"/>
-              </w:rPr>
-              <w:t xml:space="preserve">좁은 공간, 다면 검사</w:t>
+            <w:tcW w:type="dxa" w:w="2000"/>
+            <w:tcMar>
+              <w:top w:type="dxa" w:w="40"/>
+              <w:left w:type="dxa" w:w="80"/>
+              <w:bottom w:type="dxa" w:w="40"/>
+              <w:right w:type="dxa" w:w="80"/>
+            </w:tcMar>
+            <w:vAlign w:val="center"/>
+          </w:tcPr>
+          <w:p>
+            <w:pPr>
+              <w:spacing w:after="0" w:before="0"/>
+              <w:jc w:val="left"/>
+            </w:pPr>
+            <w:r>
+              <w:rPr>
+                <w:rFonts w:ascii="맑은 고딕" w:cs="맑은 고딕" w:eastAsia="맑은 고딕" w:hAnsi="맑은 고딕"/>
+                <w:b w:val="false"/>
+                <w:bCs w:val="false"/>
+                <w:color w:val="2E2E2E"/>
+                <w:sz w:val="19"/>
+                <w:szCs w:val="19"/>
+              </w:rPr>
+              <w:t xml:space="preserve">표준형</w:t>
+            </w:r>
+          </w:p>
+        </w:tc>
+        <w:tc>
+          <w:tcPr>
+            <w:tcW w:type="dxa" w:w="5252"/>
+            <w:tcMar>
+              <w:top w:type="dxa" w:w="40"/>
+              <w:left w:type="dxa" w:w="80"/>
+              <w:bottom w:type="dxa" w:w="40"/>
+              <w:right w:type="dxa" w:w="80"/>
+            </w:tcMar>
+            <w:vAlign w:val="center"/>
+          </w:tcPr>
+          <w:p>
+            <w:pPr>
+              <w:spacing w:after="0" w:before="0"/>
+              <w:jc w:val="left"/>
+            </w:pPr>
+            <w:r>
+              <w:rPr>
+                <w:rFonts w:ascii="맑은 고딕" w:cs="맑은 고딕" w:eastAsia="맑은 고딕" w:hAnsi="맑은 고딕"/>
+                <w:b w:val="false"/>
+                <w:bCs w:val="false"/>
+                <w:color w:val="2E2E2E"/>
+                <w:sz w:val="19"/>
+                <w:szCs w:val="19"/>
+              </w:rPr>
+              <w:t xml:space="preserve">자동 투입·배출 + 바코드 자동 스캔</w:t>
+            </w:r>
+          </w:p>
+        </w:tc>
+        <w:tc>
+          <w:tcPr>
+            <w:tcW w:type="dxa" w:w="2500"/>
+            <w:tcMar>
+              <w:top w:type="dxa" w:w="40"/>
+              <w:left w:type="dxa" w:w="80"/>
+              <w:bottom w:type="dxa" w:w="40"/>
+              <w:right w:type="dxa" w:w="80"/>
+            </w:tcMar>
+            <w:vAlign w:val="center"/>
+          </w:tcPr>
+          <w:p>
+            <w:pPr>
+              <w:spacing w:after="0" w:before="0"/>
+              <w:jc w:val="left"/>
+            </w:pPr>
+            <w:r>
+              <w:rPr>
+                <w:rFonts w:ascii="맑은 고딕" w:cs="맑은 고딕" w:eastAsia="맑은 고딕" w:hAnsi="맑은 고딕"/>
+                <w:b w:val="false"/>
+                <w:bCs w:val="false"/>
+                <w:color w:val="2E2E2E"/>
+                <w:sz w:val="19"/>
+                <w:szCs w:val="19"/>
+              </w:rPr>
+              <w:t xml:space="preserve">중간</w:t>
             </w:r>
           </w:p>
         </w:tc>
@@ -1319,266 +1442,88 @@
       <w:tr>
         <w:tc>
           <w:tcPr>
-            <w:tcW w:type="dxa" w:w="1800"/>
-            <w:tcMar>
-              <w:top w:type="dxa" w:w="40"/>
-              <w:left w:type="dxa" w:w="80"/>
-              <w:bottom w:type="dxa" w:w="40"/>
-              <w:right w:type="dxa" w:w="80"/>
-            </w:tcMar>
-            <w:vAlign w:val="center"/>
-          </w:tcPr>
-          <w:p>
-            <w:pPr>
-              <w:spacing w:after="0" w:before="0"/>
-              <w:jc w:val="left"/>
-            </w:pPr>
-            <w:r>
-              <w:rPr>
-                <w:rFonts w:ascii="맑은 고딕" w:cs="맑은 고딕" w:eastAsia="맑은 고딕" w:hAnsi="맑은 고딕"/>
-                <w:b w:val="false"/>
-                <w:bCs w:val="false"/>
-                <w:color w:val="2E2E2E"/>
-                <w:sz w:val="19"/>
-                <w:szCs w:val="19"/>
-              </w:rPr>
-              <w:t xml:space="preserve">처리 방식</w:t>
-            </w:r>
-          </w:p>
-        </w:tc>
-        <w:tc>
-          <w:tcPr>
-            <w:tcW w:type="dxa" w:w="3976"/>
-            <w:tcMar>
-              <w:top w:type="dxa" w:w="40"/>
-              <w:left w:type="dxa" w:w="80"/>
-              <w:bottom w:type="dxa" w:w="40"/>
-              <w:right w:type="dxa" w:w="80"/>
-            </w:tcMar>
-            <w:vAlign w:val="center"/>
-          </w:tcPr>
-          <w:p>
-            <w:pPr>
-              <w:spacing w:after="0" w:before="0"/>
-              <w:jc w:val="left"/>
-            </w:pPr>
-            <w:r>
-              <w:rPr>
-                <w:rFonts w:ascii="맑은 고딕" w:cs="맑은 고딕" w:eastAsia="맑은 고딕" w:hAnsi="맑은 고딕"/>
-                <w:b w:val="false"/>
-                <w:bCs w:val="false"/>
-                <w:color w:val="2E2E2E"/>
-                <w:sz w:val="19"/>
-                <w:szCs w:val="19"/>
-              </w:rPr>
-              <w:t xml:space="preserve">연속 이송</w:t>
-            </w:r>
-          </w:p>
-        </w:tc>
-        <w:tc>
-          <w:tcPr>
-            <w:tcW w:type="dxa" w:w="3976"/>
-            <w:tcMar>
-              <w:top w:type="dxa" w:w="40"/>
-              <w:left w:type="dxa" w:w="80"/>
-              <w:bottom w:type="dxa" w:w="40"/>
-              <w:right w:type="dxa" w:w="80"/>
-            </w:tcMar>
-            <w:vAlign w:val="center"/>
-          </w:tcPr>
-          <w:p>
-            <w:pPr>
-              <w:spacing w:after="0" w:before="0"/>
-              <w:jc w:val="left"/>
-            </w:pPr>
-            <w:r>
-              <w:rPr>
-                <w:rFonts w:ascii="맑은 고딕" w:cs="맑은 고딕" w:eastAsia="맑은 고딕" w:hAnsi="맑은 고딕"/>
-                <w:b w:val="false"/>
-                <w:bCs w:val="false"/>
-                <w:color w:val="2E2E2E"/>
-                <w:sz w:val="19"/>
-                <w:szCs w:val="19"/>
-              </w:rPr>
-              <w:t xml:space="preserve">스텝 단위 정지 검사</w:t>
-            </w:r>
-          </w:p>
-        </w:tc>
-      </w:tr>
-      <w:tr>
-        <w:tc>
-          <w:tcPr>
-            <w:tcW w:type="dxa" w:w="1800"/>
-            <w:tcMar>
-              <w:top w:type="dxa" w:w="40"/>
-              <w:left w:type="dxa" w:w="80"/>
-              <w:bottom w:type="dxa" w:w="40"/>
-              <w:right w:type="dxa" w:w="80"/>
-            </w:tcMar>
-            <w:vAlign w:val="center"/>
-          </w:tcPr>
-          <w:p>
-            <w:pPr>
-              <w:spacing w:after="0" w:before="0"/>
-              <w:jc w:val="left"/>
-            </w:pPr>
-            <w:r>
-              <w:rPr>
-                <w:rFonts w:ascii="맑은 고딕" w:cs="맑은 고딕" w:eastAsia="맑은 고딕" w:hAnsi="맑은 고딕"/>
-                <w:b w:val="false"/>
-                <w:bCs w:val="false"/>
-                <w:color w:val="2E2E2E"/>
-                <w:sz w:val="19"/>
-                <w:szCs w:val="19"/>
-              </w:rPr>
-              <w:t xml:space="preserve">소요 공간</w:t>
-            </w:r>
-          </w:p>
-        </w:tc>
-        <w:tc>
-          <w:tcPr>
-            <w:tcW w:type="dxa" w:w="3976"/>
-            <w:tcMar>
-              <w:top w:type="dxa" w:w="40"/>
-              <w:left w:type="dxa" w:w="80"/>
-              <w:bottom w:type="dxa" w:w="40"/>
-              <w:right w:type="dxa" w:w="80"/>
-            </w:tcMar>
-            <w:vAlign w:val="center"/>
-          </w:tcPr>
-          <w:p>
-            <w:pPr>
-              <w:spacing w:after="0" w:before="0"/>
-              <w:jc w:val="left"/>
-            </w:pPr>
-            <w:r>
-              <w:rPr>
-                <w:rFonts w:ascii="맑은 고딕" w:cs="맑은 고딕" w:eastAsia="맑은 고딕" w:hAnsi="맑은 고딕"/>
-                <w:b w:val="false"/>
-                <w:bCs w:val="false"/>
-                <w:color w:val="2E2E2E"/>
-                <w:sz w:val="19"/>
-                <w:szCs w:val="19"/>
-              </w:rPr>
-              <w:t xml:space="preserve">길이 방향으로 김</w:t>
-            </w:r>
-          </w:p>
-        </w:tc>
-        <w:tc>
-          <w:tcPr>
-            <w:tcW w:type="dxa" w:w="3976"/>
-            <w:tcMar>
-              <w:top w:type="dxa" w:w="40"/>
-              <w:left w:type="dxa" w:w="80"/>
-              <w:bottom w:type="dxa" w:w="40"/>
-              <w:right w:type="dxa" w:w="80"/>
-            </w:tcMar>
-            <w:vAlign w:val="center"/>
-          </w:tcPr>
-          <w:p>
-            <w:pPr>
-              <w:spacing w:after="0" w:before="0"/>
-              <w:jc w:val="left"/>
-            </w:pPr>
-            <w:r>
-              <w:rPr>
-                <w:rFonts w:ascii="맑은 고딕" w:cs="맑은 고딕" w:eastAsia="맑은 고딕" w:hAnsi="맑은 고딕"/>
-                <w:b w:val="false"/>
-                <w:bCs w:val="false"/>
-                <w:color w:val="2E2E2E"/>
-                <w:sz w:val="19"/>
-                <w:szCs w:val="19"/>
-              </w:rPr>
-              <w:t xml:space="preserve">정사각 형태</w:t>
-            </w:r>
-          </w:p>
-        </w:tc>
-      </w:tr>
-      <w:tr>
-        <w:tc>
-          <w:tcPr>
-            <w:tcW w:type="dxa" w:w="1800"/>
-            <w:tcMar>
-              <w:top w:type="dxa" w:w="40"/>
-              <w:left w:type="dxa" w:w="80"/>
-              <w:bottom w:type="dxa" w:w="40"/>
-              <w:right w:type="dxa" w:w="80"/>
-            </w:tcMar>
-            <w:vAlign w:val="center"/>
-          </w:tcPr>
-          <w:p>
-            <w:pPr>
-              <w:spacing w:after="0" w:before="0"/>
-              <w:jc w:val="left"/>
-            </w:pPr>
-            <w:r>
-              <w:rPr>
-                <w:rFonts w:ascii="맑은 고딕" w:cs="맑은 고딕" w:eastAsia="맑은 고딕" w:hAnsi="맑은 고딕"/>
-                <w:b w:val="false"/>
-                <w:bCs w:val="false"/>
-                <w:color w:val="2E2E2E"/>
-                <w:sz w:val="19"/>
-                <w:szCs w:val="19"/>
-              </w:rPr>
-              <w:t xml:space="preserve">다면 검사</w:t>
-            </w:r>
-          </w:p>
-        </w:tc>
-        <w:tc>
-          <w:tcPr>
-            <w:tcW w:type="dxa" w:w="3976"/>
-            <w:tcMar>
-              <w:top w:type="dxa" w:w="40"/>
-              <w:left w:type="dxa" w:w="80"/>
-              <w:bottom w:type="dxa" w:w="40"/>
-              <w:right w:type="dxa" w:w="80"/>
-            </w:tcMar>
-            <w:vAlign w:val="center"/>
-          </w:tcPr>
-          <w:p>
-            <w:pPr>
-              <w:spacing w:after="0" w:before="0"/>
-              <w:jc w:val="left"/>
-            </w:pPr>
-            <w:r>
-              <w:rPr>
-                <w:rFonts w:ascii="맑은 고딕" w:cs="맑은 고딕" w:eastAsia="맑은 고딕" w:hAnsi="맑은 고딕"/>
-                <w:b w:val="false"/>
-                <w:bCs w:val="false"/>
-                <w:color w:val="2E2E2E"/>
-                <w:sz w:val="19"/>
-                <w:szCs w:val="19"/>
-              </w:rPr>
-              <w:t xml:space="preserve">제한적</w:t>
-            </w:r>
-          </w:p>
-        </w:tc>
-        <w:tc>
-          <w:tcPr>
-            <w:tcW w:type="dxa" w:w="3976"/>
-            <w:tcMar>
-              <w:top w:type="dxa" w:w="40"/>
-              <w:left w:type="dxa" w:w="80"/>
-              <w:bottom w:type="dxa" w:w="40"/>
-              <w:right w:type="dxa" w:w="80"/>
-            </w:tcMar>
-            <w:vAlign w:val="center"/>
-          </w:tcPr>
-          <w:p>
-            <w:pPr>
-              <w:spacing w:after="0" w:before="0"/>
-              <w:jc w:val="left"/>
-            </w:pPr>
-            <w:r>
-              <w:rPr>
-                <w:rFonts w:ascii="맑은 고딕" w:cs="맑은 고딕" w:eastAsia="맑은 고딕" w:hAnsi="맑은 고딕"/>
-                <w:b w:val="false"/>
-                <w:bCs w:val="false"/>
-                <w:color w:val="2E2E2E"/>
-                <w:sz w:val="19"/>
-                <w:szCs w:val="19"/>
-              </w:rPr>
-              <w:t xml:space="preserve">유리 (회전 중 각도 변경)</w:t>
+            <w:tcW w:type="dxa" w:w="2000"/>
+            <w:tcMar>
+              <w:top w:type="dxa" w:w="40"/>
+              <w:left w:type="dxa" w:w="80"/>
+              <w:bottom w:type="dxa" w:w="40"/>
+              <w:right w:type="dxa" w:w="80"/>
+            </w:tcMar>
+            <w:vAlign w:val="center"/>
+          </w:tcPr>
+          <w:p>
+            <w:pPr>
+              <w:spacing w:after="0" w:before="0"/>
+              <w:jc w:val="left"/>
+            </w:pPr>
+            <w:r>
+              <w:rPr>
+                <w:rFonts w:ascii="맑은 고딕" w:cs="맑은 고딕" w:eastAsia="맑은 고딕" w:hAnsi="맑은 고딕"/>
+                <w:b w:val="false"/>
+                <w:bCs w:val="false"/>
+                <w:color w:val="2E2E2E"/>
+                <w:sz w:val="19"/>
+                <w:szCs w:val="19"/>
+              </w:rPr>
+              <w:t xml:space="preserve">고급형</w:t>
+            </w:r>
+          </w:p>
+        </w:tc>
+        <w:tc>
+          <w:tcPr>
+            <w:tcW w:type="dxa" w:w="5252"/>
+            <w:tcMar>
+              <w:top w:type="dxa" w:w="40"/>
+              <w:left w:type="dxa" w:w="80"/>
+              <w:bottom w:type="dxa" w:w="40"/>
+              <w:right w:type="dxa" w:w="80"/>
+            </w:tcMar>
+            <w:vAlign w:val="center"/>
+          </w:tcPr>
+          <w:p>
+            <w:pPr>
+              <w:spacing w:after="0" w:before="0"/>
+              <w:jc w:val="left"/>
+            </w:pPr>
+            <w:r>
+              <w:rPr>
+                <w:rFonts w:ascii="맑은 고딕" w:cs="맑은 고딕" w:eastAsia="맑은 고딕" w:hAnsi="맑은 고딕"/>
+                <w:b w:val="false"/>
+                <w:bCs w:val="false"/>
+                <w:color w:val="2E2E2E"/>
+                <w:sz w:val="19"/>
+                <w:szCs w:val="19"/>
+              </w:rPr>
+              <w:t xml:space="preserve">표준형 + NG 자동 분리 + MES 연동</w:t>
+            </w:r>
+          </w:p>
+        </w:tc>
+        <w:tc>
+          <w:tcPr>
+            <w:tcW w:type="dxa" w:w="2500"/>
+            <w:tcMar>
+              <w:top w:type="dxa" w:w="40"/>
+              <w:left w:type="dxa" w:w="80"/>
+              <w:bottom w:type="dxa" w:w="40"/>
+              <w:right w:type="dxa" w:w="80"/>
+            </w:tcMar>
+            <w:vAlign w:val="center"/>
+          </w:tcPr>
+          <w:p>
+            <w:pPr>
+              <w:spacing w:after="0" w:before="0"/>
+              <w:jc w:val="left"/>
+            </w:pPr>
+            <w:r>
+              <w:rPr>
+                <w:rFonts w:ascii="맑은 고딕" w:cs="맑은 고딕" w:eastAsia="맑은 고딕" w:hAnsi="맑은 고딕"/>
+                <w:b w:val="false"/>
+                <w:bCs w:val="false"/>
+                <w:color w:val="2E2E2E"/>
+                <w:sz w:val="19"/>
+                <w:szCs w:val="19"/>
+              </w:rPr>
+              <w:t xml:space="preserve">높음</w:t>
             </w:r>
           </w:p>
         </w:tc>
@@ -1598,7 +1543,7 @@
           <w:sz w:val="18"/>
           <w:szCs w:val="18"/>
         </w:rPr>
-        <w:t xml:space="preserve">※ 어느 방식이 위너콤 라인에 적합한지가 본 미팅의 핵심 논의 대상입니다.</w:t>
+        <w:t xml:space="preserve">※ 양산형 기구 구성은 본 미팅에서 파악한 고객사 요구조건을 반영하여 상세 제안서에서 확정합니다. 기능이 많아질수록 제작비·임대료가 상승합니다.</w:t>
       </w:r>
     </w:p>
     <w:p>
@@ -1838,7 +1783,7 @@
           <w:sz w:val="20"/>
           <w:szCs w:val="20"/>
         </w:rPr>
-        <w:t xml:space="preserve">C. 검사기 타입 및 이송 방식</w:t>
+        <w:t xml:space="preserve">C. 검사기 도입 및 양산형 구성</w:t>
       </w:r>
     </w:p>
     <w:p>
@@ -1862,7 +1807,7 @@
           <w:sz w:val="20"/>
           <w:szCs w:val="20"/>
         </w:rPr>
-        <w:t xml:space="preserve">TYPE 1 검증형부터 시작 여부</w:t>
+        <w:t xml:space="preserve">검증기 우선 도입 방향 공유 및 협의</w:t>
       </w:r>
     </w:p>
     <w:p>
@@ -1886,7 +1831,7 @@
           <w:sz w:val="20"/>
           <w:szCs w:val="20"/>
         </w:rPr>
-        <w:t xml:space="preserve">TYPE 2 전환 시 컨베어 vs 턴테이블 선택</w:t>
+        <w:t xml:space="preserve">양산형 요구 기능 청취 (자동 투입·배출, 이송 방식, NG 분리 등)</w:t>
       </w:r>
     </w:p>
     <w:p>
@@ -1911,6 +1856,30 @@
           <w:szCs w:val="20"/>
         </w:rPr>
         <w:t xml:space="preserve">대상품 안착 방식 (지그 형태, 바코드 위치)</w:t>
+      </w:r>
+    </w:p>
+    <w:p>
+      <w:pPr>
+        <w:spacing w:after="26" w:before="26"/>
+        <w:ind w:left="340"/>
+      </w:pPr>
+      <w:r>
+        <w:rPr>
+          <w:rFonts w:ascii="맑은 고딕" w:cs="맑은 고딕" w:eastAsia="맑은 고딕" w:hAnsi="맑은 고딕"/>
+          <w:color w:val="2E4D8A"/>
+          <w:sz w:val="20"/>
+          <w:szCs w:val="20"/>
+        </w:rPr>
+        <w:t xml:space="preserve">☐  </w:t>
+      </w:r>
+      <w:r>
+        <w:rPr>
+          <w:rFonts w:ascii="맑은 고딕" w:cs="맑은 고딕" w:eastAsia="맑은 고딕" w:hAnsi="맑은 고딕"/>
+          <w:color w:val="2E2E2E"/>
+          <w:sz w:val="20"/>
+          <w:szCs w:val="20"/>
+        </w:rPr>
+        <w:t xml:space="preserve">라인 이송 방식 선호 (컨베어 / 턴테이블 / 기타)</w:t>
       </w:r>
     </w:p>
     <w:p>
@@ -2683,7 +2652,7 @@
           <w:sz w:val="20"/>
           <w:szCs w:val="20"/>
         </w:rPr>
-        <w:t xml:space="preserve">⑥ 라인 연계 (TYPE 2 대비)</w:t>
+        <w:t xml:space="preserve">⑥ 라인 연계 (양산형 대비)</w:t>
       </w:r>
     </w:p>
     <w:p>
@@ -3512,7 +3481,7 @@
                 <w:sz w:val="19"/>
                 <w:szCs w:val="19"/>
               </w:rPr>
-              <w:t xml:space="preserve">미팅 — 방향 합의, 요구사항 파악</w:t>
+              <w:t xml:space="preserve">1차 미팅 — 요구조건 청취, 자료 확보</w:t>
             </w:r>
           </w:p>
         </w:tc>
@@ -3779,7 +3748,7 @@
                 <w:sz w:val="19"/>
                 <w:szCs w:val="19"/>
               </w:rPr>
-              <w:t xml:space="preserve">상세 제안서 제출 — 구성요소·일정·임대조건</w:t>
+              <w:t xml:space="preserve">검증기 상세 제안서 제출</w:t>
             </w:r>
           </w:p>
         </w:tc>
@@ -3868,7 +3837,7 @@
                 <w:sz w:val="19"/>
                 <w:szCs w:val="19"/>
               </w:rPr>
-              <w:t xml:space="preserve">사양 확정 → 제작 착수</w:t>
+              <w:t xml:space="preserve">검증기 제작·시범 적용 → 검출력 검증</w:t>
             </w:r>
           </w:p>
         </w:tc>
@@ -3898,6 +3867,95 @@
                 <w:szCs w:val="19"/>
               </w:rPr>
               <w:t xml:space="preserve">제안 승인 후</w:t>
+            </w:r>
+          </w:p>
+        </w:tc>
+      </w:tr>
+      <w:tr>
+        <w:tc>
+          <w:tcPr>
+            <w:tcW w:type="dxa" w:w="1000"/>
+            <w:tcMar>
+              <w:top w:type="dxa" w:w="40"/>
+              <w:left w:type="dxa" w:w="80"/>
+              <w:bottom w:type="dxa" w:w="40"/>
+              <w:right w:type="dxa" w:w="80"/>
+            </w:tcMar>
+            <w:vAlign w:val="center"/>
+          </w:tcPr>
+          <w:p>
+            <w:pPr>
+              <w:spacing w:after="0" w:before="0"/>
+              <w:jc w:val="left"/>
+            </w:pPr>
+            <w:r>
+              <w:rPr>
+                <w:rFonts w:ascii="맑은 고딕" w:cs="맑은 고딕" w:eastAsia="맑은 고딕" w:hAnsi="맑은 고딕"/>
+                <w:b w:val="false"/>
+                <w:bCs w:val="false"/>
+                <w:color w:val="2E2E2E"/>
+                <w:sz w:val="19"/>
+                <w:szCs w:val="19"/>
+              </w:rPr>
+              <w:t xml:space="preserve">6</w:t>
+            </w:r>
+          </w:p>
+        </w:tc>
+        <w:tc>
+          <w:tcPr>
+            <w:tcW w:type="dxa" w:w="6000"/>
+            <w:tcMar>
+              <w:top w:type="dxa" w:w="40"/>
+              <w:left w:type="dxa" w:w="80"/>
+              <w:bottom w:type="dxa" w:w="40"/>
+              <w:right w:type="dxa" w:w="80"/>
+            </w:tcMar>
+            <w:vAlign w:val="center"/>
+          </w:tcPr>
+          <w:p>
+            <w:pPr>
+              <w:spacing w:after="0" w:before="0"/>
+              <w:jc w:val="left"/>
+            </w:pPr>
+            <w:r>
+              <w:rPr>
+                <w:rFonts w:ascii="맑은 고딕" w:cs="맑은 고딕" w:eastAsia="맑은 고딕" w:hAnsi="맑은 고딕"/>
+                <w:b w:val="false"/>
+                <w:bCs w:val="false"/>
+                <w:color w:val="2E2E2E"/>
+                <w:sz w:val="19"/>
+                <w:szCs w:val="19"/>
+              </w:rPr>
+              <w:t xml:space="preserve">양산형 검사기 사양 협의 및 제작</w:t>
+            </w:r>
+          </w:p>
+        </w:tc>
+        <w:tc>
+          <w:tcPr>
+            <w:tcW w:type="dxa" w:w="2752"/>
+            <w:tcMar>
+              <w:top w:type="dxa" w:w="40"/>
+              <w:left w:type="dxa" w:w="80"/>
+              <w:bottom w:type="dxa" w:w="40"/>
+              <w:right w:type="dxa" w:w="80"/>
+            </w:tcMar>
+            <w:vAlign w:val="center"/>
+          </w:tcPr>
+          <w:p>
+            <w:pPr>
+              <w:spacing w:after="0" w:before="0"/>
+              <w:jc w:val="left"/>
+            </w:pPr>
+            <w:r>
+              <w:rPr>
+                <w:rFonts w:ascii="맑은 고딕" w:cs="맑은 고딕" w:eastAsia="맑은 고딕" w:hAnsi="맑은 고딕"/>
+                <w:b w:val="false"/>
+                <w:bCs w:val="false"/>
+                <w:color w:val="2E2E2E"/>
+                <w:sz w:val="19"/>
+                <w:szCs w:val="19"/>
+              </w:rPr>
+              <w:t xml:space="preserve">검증 완료 후</w:t>
             </w:r>
           </w:p>
         </w:tc>

</xml_diff>